<commit_message>
Fix: Update evidence file of phase1
</commit_message>
<xml_diff>
--- a/phase1/docs/evidence_phase1.docx
+++ b/phase1/docs/evidence_phase1.docx
@@ -373,14 +373,7 @@
           <w:sz w:val="22"/>
           <w:szCs w:val="22"/>
         </w:rPr>
-        <w:t xml:space="preserve">. Pull request from </w:t>
-      </w:r>
-      <w:r>
-        <w:rPr>
-          <w:sz w:val="22"/>
-          <w:szCs w:val="22"/>
-        </w:rPr>
-        <w:t>feat-product-</w:t>
+        <w:t>. Pull request from feat-product-</w:t>
       </w:r>
       <w:proofErr w:type="spellStart"/>
       <w:r>
@@ -517,14 +510,7 @@
           <w:sz w:val="22"/>
           <w:szCs w:val="22"/>
         </w:rPr>
-        <w:t xml:space="preserve">. </w:t>
-      </w:r>
-      <w:r>
-        <w:rPr>
-          <w:sz w:val="22"/>
-          <w:szCs w:val="22"/>
-        </w:rPr>
-        <w:t>Pull request from feat-product-</w:t>
+        <w:t>. Pull request from feat-product-</w:t>
       </w:r>
       <w:proofErr w:type="spellStart"/>
       <w:r>
@@ -667,34 +653,534 @@
           <w:sz w:val="22"/>
           <w:szCs w:val="22"/>
         </w:rPr>
-        <w:t xml:space="preserve">. </w:t>
-      </w:r>
-      <w:r>
-        <w:rPr>
-          <w:sz w:val="22"/>
-          <w:szCs w:val="22"/>
-        </w:rPr>
-        <w:t>Pull request from feat</w:t>
-      </w:r>
-      <w:r>
-        <w:rPr>
-          <w:sz w:val="22"/>
-          <w:szCs w:val="22"/>
-        </w:rPr>
-        <w:t>-app-setup</w:t>
-      </w:r>
-      <w:r>
-        <w:rPr>
-          <w:sz w:val="22"/>
-          <w:szCs w:val="22"/>
-        </w:rPr>
-        <w:t xml:space="preserve"> to development</w:t>
+        <w:t>. Pull request from feat-app-setup to development</w:t>
       </w:r>
     </w:p>
     <w:p>
+      <w:pPr>
+        <w:keepNext/>
+        <w:jc w:val="center"/>
+      </w:pPr>
+      <w:r>
+        <w:rPr>
+          <w:noProof/>
+        </w:rPr>
+        <w:lastRenderedPageBreak/>
+        <w:drawing>
+          <wp:inline distT="0" distB="0" distL="0" distR="0" wp14:anchorId="30C5B758" wp14:editId="564EB88B">
+            <wp:extent cx="6274227" cy="3108960"/>
+            <wp:effectExtent l="0" t="0" r="0" b="0"/>
+            <wp:docPr id="2" name="Picture 2" descr="A screenshot of a computer&#10;&#10;Description automatically generated"/>
+            <wp:cNvGraphicFramePr>
+              <a:graphicFrameLocks xmlns:a="http://schemas.openxmlformats.org/drawingml/2006/main" noChangeAspect="1"/>
+            </wp:cNvGraphicFramePr>
+            <a:graphic xmlns:a="http://schemas.openxmlformats.org/drawingml/2006/main">
+              <a:graphicData uri="http://schemas.openxmlformats.org/drawingml/2006/picture">
+                <pic:pic xmlns:pic="http://schemas.openxmlformats.org/drawingml/2006/picture">
+                  <pic:nvPicPr>
+                    <pic:cNvPr id="0" name="Picture 1"/>
+                    <pic:cNvPicPr>
+                      <a:picLocks noChangeAspect="1" noChangeArrowheads="1"/>
+                    </pic:cNvPicPr>
+                  </pic:nvPicPr>
+                  <pic:blipFill>
+                    <a:blip r:embed="rId9" cstate="print">
+                      <a:extLst>
+                        <a:ext uri="{28A0092B-C50C-407E-A947-70E740481C1C}">
+                          <a14:useLocalDpi xmlns:a14="http://schemas.microsoft.com/office/drawing/2010/main" val="0"/>
+                        </a:ext>
+                      </a:extLst>
+                    </a:blip>
+                    <a:srcRect/>
+                    <a:stretch>
+                      <a:fillRect/>
+                    </a:stretch>
+                  </pic:blipFill>
+                  <pic:spPr bwMode="auto">
+                    <a:xfrm>
+                      <a:off x="0" y="0"/>
+                      <a:ext cx="6281456" cy="3112542"/>
+                    </a:xfrm>
+                    <a:prstGeom prst="rect">
+                      <a:avLst/>
+                    </a:prstGeom>
+                    <a:noFill/>
+                    <a:ln>
+                      <a:noFill/>
+                    </a:ln>
+                  </pic:spPr>
+                </pic:pic>
+              </a:graphicData>
+            </a:graphic>
+          </wp:inline>
+        </w:drawing>
+      </w:r>
+    </w:p>
+    <w:p>
+      <w:pPr>
+        <w:pStyle w:val="Caption"/>
+        <w:jc w:val="center"/>
+        <w:rPr>
+          <w:sz w:val="22"/>
+          <w:szCs w:val="22"/>
+        </w:rPr>
+      </w:pPr>
+      <w:r>
+        <w:rPr>
+          <w:sz w:val="22"/>
+          <w:szCs w:val="22"/>
+        </w:rPr>
+        <w:t xml:space="preserve">Figure </w:t>
+      </w:r>
+      <w:r>
+        <w:rPr>
+          <w:sz w:val="22"/>
+          <w:szCs w:val="22"/>
+        </w:rPr>
+        <w:fldChar w:fldCharType="begin"/>
+      </w:r>
+      <w:r>
+        <w:rPr>
+          <w:sz w:val="22"/>
+          <w:szCs w:val="22"/>
+        </w:rPr>
+        <w:instrText xml:space="preserve"> SEQ Figure \* ARABIC </w:instrText>
+      </w:r>
+      <w:r>
+        <w:rPr>
+          <w:sz w:val="22"/>
+          <w:szCs w:val="22"/>
+        </w:rPr>
+        <w:fldChar w:fldCharType="separate"/>
+      </w:r>
+      <w:r>
+        <w:rPr>
+          <w:noProof/>
+          <w:sz w:val="22"/>
+          <w:szCs w:val="22"/>
+        </w:rPr>
+        <w:t>6</w:t>
+      </w:r>
+      <w:r>
+        <w:rPr>
+          <w:sz w:val="22"/>
+          <w:szCs w:val="22"/>
+        </w:rPr>
+        <w:fldChar w:fldCharType="end"/>
+      </w:r>
+      <w:r>
+        <w:rPr>
+          <w:sz w:val="22"/>
+          <w:szCs w:val="22"/>
+        </w:rPr>
+        <w:t xml:space="preserve">. </w:t>
+      </w:r>
+      <w:r>
+        <w:rPr>
+          <w:sz w:val="22"/>
+          <w:szCs w:val="22"/>
+        </w:rPr>
+        <w:t>Pull request from feat-phase1-docs to development</w:t>
+      </w:r>
+    </w:p>
+    <w:p>
+      <w:pPr>
+        <w:keepNext/>
+        <w:jc w:val="center"/>
+      </w:pPr>
+      <w:r>
+        <w:rPr>
+          <w:noProof/>
+        </w:rPr>
+        <w:drawing>
+          <wp:inline distT="0" distB="0" distL="0" distR="0" wp14:anchorId="5F9333AA" wp14:editId="1215EB00">
+            <wp:extent cx="6296284" cy="3152851"/>
+            <wp:effectExtent l="0" t="0" r="9525" b="0"/>
+            <wp:docPr id="7" name="Picture 7" descr="A screenshot of a computer&#10;&#10;Description automatically generated"/>
+            <wp:cNvGraphicFramePr>
+              <a:graphicFrameLocks xmlns:a="http://schemas.openxmlformats.org/drawingml/2006/main" noChangeAspect="1"/>
+            </wp:cNvGraphicFramePr>
+            <a:graphic xmlns:a="http://schemas.openxmlformats.org/drawingml/2006/main">
+              <a:graphicData uri="http://schemas.openxmlformats.org/drawingml/2006/picture">
+                <pic:pic xmlns:pic="http://schemas.openxmlformats.org/drawingml/2006/picture">
+                  <pic:nvPicPr>
+                    <pic:cNvPr id="0" name="Picture 3"/>
+                    <pic:cNvPicPr>
+                      <a:picLocks noChangeAspect="1" noChangeArrowheads="1"/>
+                    </pic:cNvPicPr>
+                  </pic:nvPicPr>
+                  <pic:blipFill>
+                    <a:blip r:embed="rId10" cstate="print">
+                      <a:extLst>
+                        <a:ext uri="{28A0092B-C50C-407E-A947-70E740481C1C}">
+                          <a14:useLocalDpi xmlns:a14="http://schemas.microsoft.com/office/drawing/2010/main" val="0"/>
+                        </a:ext>
+                      </a:extLst>
+                    </a:blip>
+                    <a:srcRect/>
+                    <a:stretch>
+                      <a:fillRect/>
+                    </a:stretch>
+                  </pic:blipFill>
+                  <pic:spPr bwMode="auto">
+                    <a:xfrm>
+                      <a:off x="0" y="0"/>
+                      <a:ext cx="6305510" cy="3157471"/>
+                    </a:xfrm>
+                    <a:prstGeom prst="rect">
+                      <a:avLst/>
+                    </a:prstGeom>
+                    <a:noFill/>
+                    <a:ln>
+                      <a:noFill/>
+                    </a:ln>
+                  </pic:spPr>
+                </pic:pic>
+              </a:graphicData>
+            </a:graphic>
+          </wp:inline>
+        </w:drawing>
+      </w:r>
+    </w:p>
+    <w:p>
+      <w:pPr>
+        <w:pStyle w:val="Caption"/>
+        <w:jc w:val="center"/>
+        <w:rPr>
+          <w:sz w:val="22"/>
+          <w:szCs w:val="22"/>
+        </w:rPr>
+      </w:pPr>
+      <w:r>
+        <w:rPr>
+          <w:sz w:val="22"/>
+          <w:szCs w:val="22"/>
+        </w:rPr>
+        <w:t xml:space="preserve">Figure </w:t>
+      </w:r>
+      <w:r>
+        <w:rPr>
+          <w:sz w:val="22"/>
+          <w:szCs w:val="22"/>
+        </w:rPr>
+        <w:fldChar w:fldCharType="begin"/>
+      </w:r>
+      <w:r>
+        <w:rPr>
+          <w:sz w:val="22"/>
+          <w:szCs w:val="22"/>
+        </w:rPr>
+        <w:instrText xml:space="preserve"> SEQ Figure \* ARABIC </w:instrText>
+      </w:r>
+      <w:r>
+        <w:rPr>
+          <w:sz w:val="22"/>
+          <w:szCs w:val="22"/>
+        </w:rPr>
+        <w:fldChar w:fldCharType="separate"/>
+      </w:r>
+      <w:r>
+        <w:rPr>
+          <w:noProof/>
+          <w:sz w:val="22"/>
+          <w:szCs w:val="22"/>
+        </w:rPr>
+        <w:t>7</w:t>
+      </w:r>
+      <w:r>
+        <w:rPr>
+          <w:sz w:val="22"/>
+          <w:szCs w:val="22"/>
+        </w:rPr>
+        <w:fldChar w:fldCharType="end"/>
+      </w:r>
+      <w:r>
+        <w:rPr>
+          <w:sz w:val="22"/>
+          <w:szCs w:val="22"/>
+        </w:rPr>
+        <w:t xml:space="preserve">. </w:t>
+      </w:r>
+      <w:r>
+        <w:rPr>
+          <w:sz w:val="22"/>
+          <w:szCs w:val="22"/>
+        </w:rPr>
+        <w:t>Pull request from feat-phase1-scripts to development</w:t>
+      </w:r>
+    </w:p>
+    <w:p>
+      <w:pPr>
+        <w:keepNext/>
+        <w:jc w:val="center"/>
+      </w:pPr>
+      <w:r>
+        <w:rPr>
+          <w:noProof/>
+        </w:rPr>
+        <w:lastRenderedPageBreak/>
+        <w:drawing>
+          <wp:inline distT="0" distB="0" distL="0" distR="0" wp14:anchorId="03D3D97B" wp14:editId="02F9DD89">
+            <wp:extent cx="5943600" cy="3298190"/>
+            <wp:effectExtent l="0" t="0" r="0" b="0"/>
+            <wp:docPr id="8" name="Picture 8" descr="A screenshot of a computer program&#10;&#10;Description automatically generated"/>
+            <wp:cNvGraphicFramePr>
+              <a:graphicFrameLocks xmlns:a="http://schemas.openxmlformats.org/drawingml/2006/main" noChangeAspect="1"/>
+            </wp:cNvGraphicFramePr>
+            <a:graphic xmlns:a="http://schemas.openxmlformats.org/drawingml/2006/main">
+              <a:graphicData uri="http://schemas.openxmlformats.org/drawingml/2006/picture">
+                <pic:pic xmlns:pic="http://schemas.openxmlformats.org/drawingml/2006/picture">
+                  <pic:nvPicPr>
+                    <pic:cNvPr id="0" name="Picture 5"/>
+                    <pic:cNvPicPr>
+                      <a:picLocks noChangeAspect="1" noChangeArrowheads="1"/>
+                    </pic:cNvPicPr>
+                  </pic:nvPicPr>
+                  <pic:blipFill>
+                    <a:blip r:embed="rId11" cstate="print">
+                      <a:extLst>
+                        <a:ext uri="{28A0092B-C50C-407E-A947-70E740481C1C}">
+                          <a14:useLocalDpi xmlns:a14="http://schemas.microsoft.com/office/drawing/2010/main" val="0"/>
+                        </a:ext>
+                      </a:extLst>
+                    </a:blip>
+                    <a:srcRect/>
+                    <a:stretch>
+                      <a:fillRect/>
+                    </a:stretch>
+                  </pic:blipFill>
+                  <pic:spPr bwMode="auto">
+                    <a:xfrm>
+                      <a:off x="0" y="0"/>
+                      <a:ext cx="5943600" cy="3298190"/>
+                    </a:xfrm>
+                    <a:prstGeom prst="rect">
+                      <a:avLst/>
+                    </a:prstGeom>
+                    <a:noFill/>
+                    <a:ln>
+                      <a:noFill/>
+                    </a:ln>
+                  </pic:spPr>
+                </pic:pic>
+              </a:graphicData>
+            </a:graphic>
+          </wp:inline>
+        </w:drawing>
+      </w:r>
+    </w:p>
+    <w:p>
+      <w:pPr>
+        <w:pStyle w:val="Caption"/>
+        <w:jc w:val="center"/>
+        <w:rPr>
+          <w:sz w:val="22"/>
+          <w:szCs w:val="22"/>
+        </w:rPr>
+      </w:pPr>
+      <w:r>
+        <w:rPr>
+          <w:sz w:val="22"/>
+          <w:szCs w:val="22"/>
+        </w:rPr>
+        <w:t xml:space="preserve">Figure </w:t>
+      </w:r>
+      <w:r>
+        <w:rPr>
+          <w:sz w:val="22"/>
+          <w:szCs w:val="22"/>
+        </w:rPr>
+        <w:fldChar w:fldCharType="begin"/>
+      </w:r>
+      <w:r>
+        <w:rPr>
+          <w:sz w:val="22"/>
+          <w:szCs w:val="22"/>
+        </w:rPr>
+        <w:instrText xml:space="preserve"> SEQ Figure \* ARABIC </w:instrText>
+      </w:r>
+      <w:r>
+        <w:rPr>
+          <w:sz w:val="22"/>
+          <w:szCs w:val="22"/>
+        </w:rPr>
+        <w:fldChar w:fldCharType="separate"/>
+      </w:r>
+      <w:r>
+        <w:rPr>
+          <w:noProof/>
+          <w:sz w:val="22"/>
+          <w:szCs w:val="22"/>
+        </w:rPr>
+        <w:t>8</w:t>
+      </w:r>
+      <w:r>
+        <w:rPr>
+          <w:sz w:val="22"/>
+          <w:szCs w:val="22"/>
+        </w:rPr>
+        <w:fldChar w:fldCharType="end"/>
+      </w:r>
+      <w:r>
+        <w:rPr>
+          <w:sz w:val="22"/>
+          <w:szCs w:val="22"/>
+        </w:rPr>
+        <w:t>. Commit histories of branch development</w:t>
+      </w:r>
+    </w:p>
+    <w:p>
+      <w:pPr>
+        <w:keepNext/>
+        <w:jc w:val="center"/>
+      </w:pPr>
+      <w:r>
+        <w:rPr>
+          <w:noProof/>
+        </w:rPr>
+        <w:drawing>
+          <wp:inline distT="0" distB="0" distL="0" distR="0" wp14:anchorId="23278C4A" wp14:editId="746C0541">
+            <wp:extent cx="5943600" cy="3354705"/>
+            <wp:effectExtent l="0" t="0" r="0" b="0"/>
+            <wp:docPr id="9" name="Picture 9" descr="A screenshot of a computer program&#10;&#10;Description automatically generated"/>
+            <wp:cNvGraphicFramePr>
+              <a:graphicFrameLocks xmlns:a="http://schemas.openxmlformats.org/drawingml/2006/main" noChangeAspect="1"/>
+            </wp:cNvGraphicFramePr>
+            <a:graphic xmlns:a="http://schemas.openxmlformats.org/drawingml/2006/main">
+              <a:graphicData uri="http://schemas.openxmlformats.org/drawingml/2006/picture">
+                <pic:pic xmlns:pic="http://schemas.openxmlformats.org/drawingml/2006/picture">
+                  <pic:nvPicPr>
+                    <pic:cNvPr id="0" name="Picture 7"/>
+                    <pic:cNvPicPr>
+                      <a:picLocks noChangeAspect="1" noChangeArrowheads="1"/>
+                    </pic:cNvPicPr>
+                  </pic:nvPicPr>
+                  <pic:blipFill>
+                    <a:blip r:embed="rId12" cstate="print">
+                      <a:extLst>
+                        <a:ext uri="{28A0092B-C50C-407E-A947-70E740481C1C}">
+                          <a14:useLocalDpi xmlns:a14="http://schemas.microsoft.com/office/drawing/2010/main" val="0"/>
+                        </a:ext>
+                      </a:extLst>
+                    </a:blip>
+                    <a:srcRect/>
+                    <a:stretch>
+                      <a:fillRect/>
+                    </a:stretch>
+                  </pic:blipFill>
+                  <pic:spPr bwMode="auto">
+                    <a:xfrm>
+                      <a:off x="0" y="0"/>
+                      <a:ext cx="5943600" cy="3354705"/>
+                    </a:xfrm>
+                    <a:prstGeom prst="rect">
+                      <a:avLst/>
+                    </a:prstGeom>
+                    <a:noFill/>
+                    <a:ln>
+                      <a:noFill/>
+                    </a:ln>
+                  </pic:spPr>
+                </pic:pic>
+              </a:graphicData>
+            </a:graphic>
+          </wp:inline>
+        </w:drawing>
+      </w:r>
+    </w:p>
+    <w:p>
+      <w:pPr>
+        <w:pStyle w:val="Caption"/>
+        <w:jc w:val="center"/>
+        <w:rPr>
+          <w:sz w:val="22"/>
+          <w:szCs w:val="22"/>
+        </w:rPr>
+      </w:pPr>
+      <w:r>
+        <w:rPr>
+          <w:sz w:val="22"/>
+          <w:szCs w:val="22"/>
+        </w:rPr>
+        <w:t xml:space="preserve">Figure </w:t>
+      </w:r>
+      <w:r>
+        <w:rPr>
+          <w:sz w:val="22"/>
+          <w:szCs w:val="22"/>
+        </w:rPr>
+        <w:fldChar w:fldCharType="begin"/>
+      </w:r>
+      <w:r>
+        <w:rPr>
+          <w:sz w:val="22"/>
+          <w:szCs w:val="22"/>
+        </w:rPr>
+        <w:instrText xml:space="preserve"> SEQ Figure \* ARABIC </w:instrText>
+      </w:r>
+      <w:r>
+        <w:rPr>
+          <w:sz w:val="22"/>
+          <w:szCs w:val="22"/>
+        </w:rPr>
+        <w:fldChar w:fldCharType="separate"/>
+      </w:r>
+      <w:r>
+        <w:rPr>
+          <w:noProof/>
+          <w:sz w:val="22"/>
+          <w:szCs w:val="22"/>
+        </w:rPr>
+        <w:t>9</w:t>
+      </w:r>
+      <w:r>
+        <w:rPr>
+          <w:sz w:val="22"/>
+          <w:szCs w:val="22"/>
+        </w:rPr>
+        <w:fldChar w:fldCharType="end"/>
+      </w:r>
+      <w:r>
+        <w:rPr>
+          <w:sz w:val="22"/>
+          <w:szCs w:val="22"/>
+        </w:rPr>
+        <w:t xml:space="preserve">. </w:t>
+      </w:r>
+      <w:r>
+        <w:rPr>
+          <w:sz w:val="22"/>
+          <w:szCs w:val="22"/>
+        </w:rPr>
+        <w:t>Commit histories of branch development</w:t>
+      </w:r>
+      <w:r>
+        <w:rPr>
+          <w:sz w:val="22"/>
+          <w:szCs w:val="22"/>
+        </w:rPr>
+        <w:t xml:space="preserve"> (</w:t>
+      </w:r>
+      <w:proofErr w:type="spellStart"/>
+      <w:r>
+        <w:rPr>
+          <w:sz w:val="22"/>
+          <w:szCs w:val="22"/>
+        </w:rPr>
+        <w:t>cont</w:t>
+      </w:r>
+      <w:proofErr w:type="spellEnd"/>
+      <w:r>
+        <w:rPr>
+          <w:sz w:val="22"/>
+          <w:szCs w:val="22"/>
+        </w:rPr>
+        <w:t>)</w:t>
+      </w:r>
       <w:bookmarkStart w:id="0" w:name="_GoBack"/>
       <w:bookmarkEnd w:id="0"/>
     </w:p>
+    <w:p/>
     <w:sectPr>
       <w:pgSz w:w="12240" w:h="15840"/>
       <w:pgMar w:top="1440" w:right="1440" w:bottom="1440" w:left="1440" w:header="720" w:footer="720" w:gutter="0"/>

</xml_diff>

<commit_message>
Fix: Update evidence (screenshots) for phase 1,2,3
</commit_message>
<xml_diff>
--- a/phase1/docs/evidence_phase1.docx
+++ b/phase1/docs/evidence_phase1.docx
@@ -258,6 +258,7 @@
         <w:t>. Branch protection rules</w:t>
       </w:r>
     </w:p>
+    <w:p/>
     <w:p>
       <w:pPr>
         <w:keepNext/>
@@ -536,6 +537,7 @@
         <w:t xml:space="preserve"> to development</w:t>
       </w:r>
     </w:p>
+    <w:p/>
     <w:p>
       <w:pPr>
         <w:keepNext/>
@@ -773,16 +775,10 @@
           <w:sz w:val="22"/>
           <w:szCs w:val="22"/>
         </w:rPr>
-        <w:t xml:space="preserve">. </w:t>
-      </w:r>
-      <w:r>
-        <w:rPr>
-          <w:sz w:val="22"/>
-          <w:szCs w:val="22"/>
-        </w:rPr>
-        <w:t>Pull request from feat-phase1-docs to development</w:t>
-      </w:r>
-    </w:p>
+        <w:t>. Pull request from feat-phase1-docs to development</w:t>
+      </w:r>
+    </w:p>
+    <w:p/>
     <w:p>
       <w:pPr>
         <w:keepNext/>
@@ -899,16 +895,10 @@
           <w:sz w:val="22"/>
           <w:szCs w:val="22"/>
         </w:rPr>
-        <w:t xml:space="preserve">. </w:t>
-      </w:r>
-      <w:r>
-        <w:rPr>
-          <w:sz w:val="22"/>
-          <w:szCs w:val="22"/>
-        </w:rPr>
-        <w:t>Pull request from feat-phase1-scripts to development</w:t>
-      </w:r>
-    </w:p>
+        <w:t>. Pull request from feat-phase1-scripts to development</w:t>
+      </w:r>
+    </w:p>
+    <w:p/>
     <w:p>
       <w:pPr>
         <w:keepNext/>
@@ -920,10 +910,10 @@
         </w:rPr>
         <w:lastRenderedPageBreak/>
         <w:drawing>
-          <wp:inline distT="0" distB="0" distL="0" distR="0" wp14:anchorId="03D3D97B" wp14:editId="02F9DD89">
-            <wp:extent cx="5943600" cy="3298190"/>
-            <wp:effectExtent l="0" t="0" r="0" b="0"/>
-            <wp:docPr id="8" name="Picture 8" descr="A screenshot of a computer program&#10;&#10;Description automatically generated"/>
+          <wp:inline distT="0" distB="0" distL="0" distR="0" wp14:anchorId="06DC2429" wp14:editId="0A40C080">
+            <wp:extent cx="5943600" cy="3388995"/>
+            <wp:effectExtent l="0" t="0" r="0" b="1905"/>
+            <wp:docPr id="13" name="Picture 13" descr="A screenshot of a computer&#10;&#10;Description automatically generated"/>
             <wp:cNvGraphicFramePr>
               <a:graphicFrameLocks xmlns:a="http://schemas.openxmlformats.org/drawingml/2006/main" noChangeAspect="1"/>
             </wp:cNvGraphicFramePr>
@@ -931,36 +921,23 @@
               <a:graphicData uri="http://schemas.openxmlformats.org/drawingml/2006/picture">
                 <pic:pic xmlns:pic="http://schemas.openxmlformats.org/drawingml/2006/picture">
                   <pic:nvPicPr>
-                    <pic:cNvPr id="0" name="Picture 5"/>
-                    <pic:cNvPicPr>
-                      <a:picLocks noChangeAspect="1" noChangeArrowheads="1"/>
-                    </pic:cNvPicPr>
+                    <pic:cNvPr id="1" name=""/>
+                    <pic:cNvPicPr/>
                   </pic:nvPicPr>
                   <pic:blipFill>
-                    <a:blip r:embed="rId11" cstate="print">
-                      <a:extLst>
-                        <a:ext uri="{28A0092B-C50C-407E-A947-70E740481C1C}">
-                          <a14:useLocalDpi xmlns:a14="http://schemas.microsoft.com/office/drawing/2010/main" val="0"/>
-                        </a:ext>
-                      </a:extLst>
-                    </a:blip>
-                    <a:srcRect/>
+                    <a:blip r:embed="rId11"/>
                     <a:stretch>
                       <a:fillRect/>
                     </a:stretch>
                   </pic:blipFill>
-                  <pic:spPr bwMode="auto">
+                  <pic:spPr>
                     <a:xfrm>
                       <a:off x="0" y="0"/>
-                      <a:ext cx="5943600" cy="3298190"/>
+                      <a:ext cx="5943600" cy="3388995"/>
                     </a:xfrm>
                     <a:prstGeom prst="rect">
                       <a:avLst/>
                     </a:prstGeom>
-                    <a:noFill/>
-                    <a:ln>
-                      <a:noFill/>
-                    </a:ln>
                   </pic:spPr>
                 </pic:pic>
               </a:graphicData>
@@ -1026,23 +1003,23 @@
           <w:sz w:val="22"/>
           <w:szCs w:val="22"/>
         </w:rPr>
-        <w:t>. Commit histories of branch development</w:t>
-      </w:r>
-    </w:p>
+        <w:t>. Pull request from feat-phase2-deployment to development</w:t>
+      </w:r>
+    </w:p>
+    <w:p/>
     <w:p>
       <w:pPr>
         <w:keepNext/>
-        <w:jc w:val="center"/>
       </w:pPr>
       <w:r>
         <w:rPr>
           <w:noProof/>
         </w:rPr>
         <w:drawing>
-          <wp:inline distT="0" distB="0" distL="0" distR="0" wp14:anchorId="23278C4A" wp14:editId="746C0541">
-            <wp:extent cx="5943600" cy="3354705"/>
-            <wp:effectExtent l="0" t="0" r="0" b="0"/>
-            <wp:docPr id="9" name="Picture 9" descr="A screenshot of a computer program&#10;&#10;Description automatically generated"/>
+          <wp:inline distT="0" distB="0" distL="0" distR="0" wp14:anchorId="7A913079" wp14:editId="58E73D8E">
+            <wp:extent cx="5943600" cy="3327400"/>
+            <wp:effectExtent l="0" t="0" r="0" b="6350"/>
+            <wp:docPr id="14" name="Picture 14" descr="A screenshot of a computer&#10;&#10;Description automatically generated"/>
             <wp:cNvGraphicFramePr>
               <a:graphicFrameLocks xmlns:a="http://schemas.openxmlformats.org/drawingml/2006/main" noChangeAspect="1"/>
             </wp:cNvGraphicFramePr>
@@ -1050,36 +1027,23 @@
               <a:graphicData uri="http://schemas.openxmlformats.org/drawingml/2006/picture">
                 <pic:pic xmlns:pic="http://schemas.openxmlformats.org/drawingml/2006/picture">
                   <pic:nvPicPr>
-                    <pic:cNvPr id="0" name="Picture 7"/>
-                    <pic:cNvPicPr>
-                      <a:picLocks noChangeAspect="1" noChangeArrowheads="1"/>
-                    </pic:cNvPicPr>
+                    <pic:cNvPr id="1" name=""/>
+                    <pic:cNvPicPr/>
                   </pic:nvPicPr>
                   <pic:blipFill>
-                    <a:blip r:embed="rId12" cstate="print">
-                      <a:extLst>
-                        <a:ext uri="{28A0092B-C50C-407E-A947-70E740481C1C}">
-                          <a14:useLocalDpi xmlns:a14="http://schemas.microsoft.com/office/drawing/2010/main" val="0"/>
-                        </a:ext>
-                      </a:extLst>
-                    </a:blip>
-                    <a:srcRect/>
+                    <a:blip r:embed="rId12"/>
                     <a:stretch>
                       <a:fillRect/>
                     </a:stretch>
                   </pic:blipFill>
-                  <pic:spPr bwMode="auto">
+                  <pic:spPr>
                     <a:xfrm>
                       <a:off x="0" y="0"/>
-                      <a:ext cx="5943600" cy="3354705"/>
+                      <a:ext cx="5943600" cy="3327400"/>
                     </a:xfrm>
                     <a:prstGeom prst="rect">
                       <a:avLst/>
                     </a:prstGeom>
-                    <a:noFill/>
-                    <a:ln>
-                      <a:noFill/>
-                    </a:ln>
                   </pic:spPr>
                 </pic:pic>
               </a:graphicData>
@@ -1145,31 +1109,230 @@
           <w:sz w:val="22"/>
           <w:szCs w:val="22"/>
         </w:rPr>
-        <w:t xml:space="preserve">. </w:t>
-      </w:r>
-      <w:r>
-        <w:rPr>
-          <w:sz w:val="22"/>
-          <w:szCs w:val="22"/>
-        </w:rPr>
-        <w:t>Commit histories of branch development</w:t>
-      </w:r>
-      <w:r>
-        <w:rPr>
-          <w:sz w:val="22"/>
-          <w:szCs w:val="22"/>
-        </w:rPr>
-        <w:t xml:space="preserve"> (</w:t>
-      </w:r>
-      <w:proofErr w:type="spellStart"/>
-      <w:r>
-        <w:rPr>
-          <w:sz w:val="22"/>
-          <w:szCs w:val="22"/>
-        </w:rPr>
-        <w:t>cont</w:t>
-      </w:r>
-      <w:proofErr w:type="spellEnd"/>
+        <w:t>. Pull request from feat-phase3-deployment to development</w:t>
+      </w:r>
+    </w:p>
+    <w:p>
+      <w:pPr>
+        <w:keepNext/>
+        <w:jc w:val="center"/>
+      </w:pPr>
+      <w:r>
+        <w:rPr>
+          <w:noProof/>
+        </w:rPr>
+        <w:lastRenderedPageBreak/>
+        <w:drawing>
+          <wp:inline distT="0" distB="0" distL="0" distR="0" wp14:anchorId="4F156339" wp14:editId="17228BCE">
+            <wp:extent cx="5943600" cy="3458845"/>
+            <wp:effectExtent l="0" t="0" r="0" b="8255"/>
+            <wp:docPr id="10" name="Picture 10" descr="A screenshot of a computer&#10;&#10;Description automatically generated"/>
+            <wp:cNvGraphicFramePr>
+              <a:graphicFrameLocks xmlns:a="http://schemas.openxmlformats.org/drawingml/2006/main" noChangeAspect="1"/>
+            </wp:cNvGraphicFramePr>
+            <a:graphic xmlns:a="http://schemas.openxmlformats.org/drawingml/2006/main">
+              <a:graphicData uri="http://schemas.openxmlformats.org/drawingml/2006/picture">
+                <pic:pic xmlns:pic="http://schemas.openxmlformats.org/drawingml/2006/picture">
+                  <pic:nvPicPr>
+                    <pic:cNvPr id="1" name=""/>
+                    <pic:cNvPicPr/>
+                  </pic:nvPicPr>
+                  <pic:blipFill>
+                    <a:blip r:embed="rId13"/>
+                    <a:stretch>
+                      <a:fillRect/>
+                    </a:stretch>
+                  </pic:blipFill>
+                  <pic:spPr>
+                    <a:xfrm>
+                      <a:off x="0" y="0"/>
+                      <a:ext cx="5943600" cy="3458845"/>
+                    </a:xfrm>
+                    <a:prstGeom prst="rect">
+                      <a:avLst/>
+                    </a:prstGeom>
+                  </pic:spPr>
+                </pic:pic>
+              </a:graphicData>
+            </a:graphic>
+          </wp:inline>
+        </w:drawing>
+      </w:r>
+    </w:p>
+    <w:p>
+      <w:pPr>
+        <w:pStyle w:val="Caption"/>
+        <w:jc w:val="center"/>
+        <w:rPr>
+          <w:sz w:val="22"/>
+          <w:szCs w:val="22"/>
+        </w:rPr>
+      </w:pPr>
+      <w:r>
+        <w:rPr>
+          <w:sz w:val="22"/>
+          <w:szCs w:val="22"/>
+        </w:rPr>
+        <w:t xml:space="preserve">Figure </w:t>
+      </w:r>
+      <w:r>
+        <w:rPr>
+          <w:sz w:val="22"/>
+          <w:szCs w:val="22"/>
+        </w:rPr>
+        <w:fldChar w:fldCharType="begin"/>
+      </w:r>
+      <w:r>
+        <w:rPr>
+          <w:sz w:val="22"/>
+          <w:szCs w:val="22"/>
+        </w:rPr>
+        <w:instrText xml:space="preserve"> SEQ Figure \* ARABIC </w:instrText>
+      </w:r>
+      <w:r>
+        <w:rPr>
+          <w:sz w:val="22"/>
+          <w:szCs w:val="22"/>
+        </w:rPr>
+        <w:fldChar w:fldCharType="separate"/>
+      </w:r>
+      <w:r>
+        <w:rPr>
+          <w:noProof/>
+          <w:sz w:val="22"/>
+          <w:szCs w:val="22"/>
+        </w:rPr>
+        <w:t>10</w:t>
+      </w:r>
+      <w:r>
+        <w:rPr>
+          <w:sz w:val="22"/>
+          <w:szCs w:val="22"/>
+        </w:rPr>
+        <w:fldChar w:fldCharType="end"/>
+      </w:r>
+      <w:r>
+        <w:rPr>
+          <w:sz w:val="22"/>
+          <w:szCs w:val="22"/>
+        </w:rPr>
+        <w:t>. Commit histories of branch development</w:t>
+      </w:r>
+    </w:p>
+    <w:p/>
+    <w:p>
+      <w:pPr>
+        <w:keepNext/>
+        <w:ind w:left="90"/>
+        <w:jc w:val="center"/>
+      </w:pPr>
+      <w:r>
+        <w:rPr>
+          <w:noProof/>
+        </w:rPr>
+        <w:drawing>
+          <wp:inline distT="0" distB="0" distL="0" distR="0" wp14:anchorId="04024446" wp14:editId="36003779">
+            <wp:extent cx="5067300" cy="3719810"/>
+            <wp:effectExtent l="0" t="0" r="0" b="0"/>
+            <wp:docPr id="11" name="Picture 11" descr="A screenshot of a computer&#10;&#10;Description automatically generated"/>
+            <wp:cNvGraphicFramePr>
+              <a:graphicFrameLocks xmlns:a="http://schemas.openxmlformats.org/drawingml/2006/main" noChangeAspect="1"/>
+            </wp:cNvGraphicFramePr>
+            <a:graphic xmlns:a="http://schemas.openxmlformats.org/drawingml/2006/main">
+              <a:graphicData uri="http://schemas.openxmlformats.org/drawingml/2006/picture">
+                <pic:pic xmlns:pic="http://schemas.openxmlformats.org/drawingml/2006/picture">
+                  <pic:nvPicPr>
+                    <pic:cNvPr id="1" name=""/>
+                    <pic:cNvPicPr/>
+                  </pic:nvPicPr>
+                  <pic:blipFill>
+                    <a:blip r:embed="rId14"/>
+                    <a:stretch>
+                      <a:fillRect/>
+                    </a:stretch>
+                  </pic:blipFill>
+                  <pic:spPr>
+                    <a:xfrm>
+                      <a:off x="0" y="0"/>
+                      <a:ext cx="5084022" cy="3732085"/>
+                    </a:xfrm>
+                    <a:prstGeom prst="rect">
+                      <a:avLst/>
+                    </a:prstGeom>
+                  </pic:spPr>
+                </pic:pic>
+              </a:graphicData>
+            </a:graphic>
+          </wp:inline>
+        </w:drawing>
+      </w:r>
+    </w:p>
+    <w:p>
+      <w:pPr>
+        <w:pStyle w:val="Caption"/>
+        <w:jc w:val="center"/>
+        <w:rPr>
+          <w:sz w:val="22"/>
+          <w:szCs w:val="22"/>
+        </w:rPr>
+      </w:pPr>
+      <w:r>
+        <w:rPr>
+          <w:sz w:val="22"/>
+          <w:szCs w:val="22"/>
+        </w:rPr>
+        <w:t xml:space="preserve">Figure </w:t>
+      </w:r>
+      <w:r>
+        <w:rPr>
+          <w:sz w:val="22"/>
+          <w:szCs w:val="22"/>
+        </w:rPr>
+        <w:fldChar w:fldCharType="begin"/>
+      </w:r>
+      <w:r>
+        <w:rPr>
+          <w:sz w:val="22"/>
+          <w:szCs w:val="22"/>
+        </w:rPr>
+        <w:instrText xml:space="preserve"> SEQ Figure \* ARABIC </w:instrText>
+      </w:r>
+      <w:r>
+        <w:rPr>
+          <w:sz w:val="22"/>
+          <w:szCs w:val="22"/>
+        </w:rPr>
+        <w:fldChar w:fldCharType="separate"/>
+      </w:r>
+      <w:r>
+        <w:rPr>
+          <w:noProof/>
+          <w:sz w:val="22"/>
+          <w:szCs w:val="22"/>
+        </w:rPr>
+        <w:t>11</w:t>
+      </w:r>
+      <w:r>
+        <w:rPr>
+          <w:sz w:val="22"/>
+          <w:szCs w:val="22"/>
+        </w:rPr>
+        <w:fldChar w:fldCharType="end"/>
+      </w:r>
+      <w:r>
+        <w:rPr>
+          <w:sz w:val="22"/>
+          <w:szCs w:val="22"/>
+        </w:rPr>
+        <w:t>. Commit histories of branch development (cont</w:t>
+      </w:r>
+      <w:r>
+        <w:rPr>
+          <w:sz w:val="22"/>
+          <w:szCs w:val="22"/>
+        </w:rPr>
+        <w:t>inue</w:t>
+      </w:r>
       <w:r>
         <w:rPr>
           <w:sz w:val="22"/>
@@ -1177,10 +1340,122 @@
         </w:rPr>
         <w:t>)</w:t>
       </w:r>
+    </w:p>
+    <w:p>
+      <w:pPr>
+        <w:jc w:val="center"/>
+      </w:pPr>
+    </w:p>
+    <w:p>
+      <w:pPr>
+        <w:keepNext/>
+        <w:jc w:val="center"/>
+      </w:pPr>
+      <w:r>
+        <w:rPr>
+          <w:noProof/>
+        </w:rPr>
+        <w:drawing>
+          <wp:inline distT="0" distB="0" distL="0" distR="0" wp14:anchorId="2A8E0A5E" wp14:editId="6CC52FE7">
+            <wp:extent cx="5718834" cy="4006850"/>
+            <wp:effectExtent l="0" t="0" r="0" b="0"/>
+            <wp:docPr id="12" name="Picture 12" descr="A screenshot of a computer&#10;&#10;Description automatically generated"/>
+            <wp:cNvGraphicFramePr>
+              <a:graphicFrameLocks xmlns:a="http://schemas.openxmlformats.org/drawingml/2006/main" noChangeAspect="1"/>
+            </wp:cNvGraphicFramePr>
+            <a:graphic xmlns:a="http://schemas.openxmlformats.org/drawingml/2006/main">
+              <a:graphicData uri="http://schemas.openxmlformats.org/drawingml/2006/picture">
+                <pic:pic xmlns:pic="http://schemas.openxmlformats.org/drawingml/2006/picture">
+                  <pic:nvPicPr>
+                    <pic:cNvPr id="1" name=""/>
+                    <pic:cNvPicPr/>
+                  </pic:nvPicPr>
+                  <pic:blipFill>
+                    <a:blip r:embed="rId15"/>
+                    <a:stretch>
+                      <a:fillRect/>
+                    </a:stretch>
+                  </pic:blipFill>
+                  <pic:spPr>
+                    <a:xfrm>
+                      <a:off x="0" y="0"/>
+                      <a:ext cx="5721265" cy="4008553"/>
+                    </a:xfrm>
+                    <a:prstGeom prst="rect">
+                      <a:avLst/>
+                    </a:prstGeom>
+                  </pic:spPr>
+                </pic:pic>
+              </a:graphicData>
+            </a:graphic>
+          </wp:inline>
+        </w:drawing>
+      </w:r>
+    </w:p>
+    <w:p>
+      <w:pPr>
+        <w:pStyle w:val="Caption"/>
+        <w:jc w:val="center"/>
+        <w:rPr>
+          <w:sz w:val="22"/>
+          <w:szCs w:val="22"/>
+        </w:rPr>
+      </w:pPr>
+      <w:r>
+        <w:rPr>
+          <w:sz w:val="22"/>
+          <w:szCs w:val="22"/>
+        </w:rPr>
+        <w:t xml:space="preserve">Figure </w:t>
+      </w:r>
+      <w:r>
+        <w:rPr>
+          <w:sz w:val="22"/>
+          <w:szCs w:val="22"/>
+        </w:rPr>
+        <w:fldChar w:fldCharType="begin"/>
+      </w:r>
+      <w:r>
+        <w:rPr>
+          <w:sz w:val="22"/>
+          <w:szCs w:val="22"/>
+        </w:rPr>
+        <w:instrText xml:space="preserve"> SEQ Figure \* ARABIC </w:instrText>
+      </w:r>
+      <w:r>
+        <w:rPr>
+          <w:sz w:val="22"/>
+          <w:szCs w:val="22"/>
+        </w:rPr>
+        <w:fldChar w:fldCharType="separate"/>
+      </w:r>
+      <w:r>
+        <w:rPr>
+          <w:noProof/>
+          <w:sz w:val="22"/>
+          <w:szCs w:val="22"/>
+        </w:rPr>
+        <w:t>12</w:t>
+      </w:r>
+      <w:r>
+        <w:rPr>
+          <w:sz w:val="22"/>
+          <w:szCs w:val="22"/>
+        </w:rPr>
+        <w:fldChar w:fldCharType="end"/>
+      </w:r>
+      <w:r>
+        <w:rPr>
+          <w:sz w:val="22"/>
+          <w:szCs w:val="22"/>
+        </w:rPr>
+        <w:t>. Commit histories of branch development (continue)</w:t>
+      </w:r>
+    </w:p>
+    <w:p>
       <w:bookmarkStart w:id="0" w:name="_GoBack"/>
       <w:bookmarkEnd w:id="0"/>
     </w:p>
-    <w:p/>
     <w:sectPr>
       <w:pgSz w:w="12240" w:h="15840"/>
       <w:pgMar w:top="1440" w:right="1440" w:bottom="1440" w:left="1440" w:header="720" w:footer="720" w:gutter="0"/>

</xml_diff>